<commit_message>
Small updates to user manual
</commit_message>
<xml_diff>
--- a/UserManual.docx
+++ b/UserManual.docx
@@ -801,8 +801,20 @@
         <w:rPr>
           <w:rFonts w:ascii="Arial" w:hAnsi="Arial" w:cs="Arial"/>
         </w:rPr>
+        <w:t>“</w:t>
+      </w:r>
+      <w:r>
+        <w:rPr>
+          <w:rFonts w:ascii="Arial" w:hAnsi="Arial" w:cs="Arial"/>
+        </w:rPr>
         <w:t>Python –version</w:t>
       </w:r>
+      <w:r>
+        <w:rPr>
+          <w:rFonts w:ascii="Arial" w:hAnsi="Arial" w:cs="Arial"/>
+        </w:rPr>
+        <w:t>”</w:t>
+      </w:r>
     </w:p>
     <w:p>
       <w:pPr>
@@ -827,7 +839,19 @@
         <w:rPr>
           <w:rFonts w:ascii="Arial" w:hAnsi="Arial" w:cs="Arial"/>
         </w:rPr>
+        <w:t>“</w:t>
+      </w:r>
+      <w:r>
+        <w:rPr>
+          <w:rFonts w:ascii="Arial" w:hAnsi="Arial" w:cs="Arial"/>
+        </w:rPr>
         <w:t>Python3 –version</w:t>
+      </w:r>
+      <w:r>
+        <w:rPr>
+          <w:rFonts w:ascii="Arial" w:hAnsi="Arial" w:cs="Arial"/>
+        </w:rPr>
+        <w:t>”</w:t>
       </w:r>
     </w:p>
     <w:p>
@@ -1154,7 +1178,19 @@
               <w:rPr>
                 <w:rFonts w:ascii="Arial" w:hAnsi="Arial" w:cs="Arial"/>
               </w:rPr>
+              <w:t>“</w:t>
+            </w:r>
+            <w:r>
+              <w:rPr>
+                <w:rFonts w:ascii="Arial" w:hAnsi="Arial" w:cs="Arial"/>
+              </w:rPr>
               <w:t>Python3 superstudy.py</w:t>
+            </w:r>
+            <w:r>
+              <w:rPr>
+                <w:rFonts w:ascii="Arial" w:hAnsi="Arial" w:cs="Arial"/>
+              </w:rPr>
+              <w:t>”</w:t>
             </w:r>
           </w:p>
         </w:tc>
@@ -1192,7 +1228,19 @@
               <w:rPr>
                 <w:rFonts w:ascii="Arial" w:hAnsi="Arial" w:cs="Arial"/>
               </w:rPr>
+              <w:t>“</w:t>
+            </w:r>
+            <w:r>
+              <w:rPr>
+                <w:rFonts w:ascii="Arial" w:hAnsi="Arial" w:cs="Arial"/>
+              </w:rPr>
               <w:t>Python3 superstudy.pg</w:t>
+            </w:r>
+            <w:r>
+              <w:rPr>
+                <w:rFonts w:ascii="Arial" w:hAnsi="Arial" w:cs="Arial"/>
+              </w:rPr>
+              <w:t>”</w:t>
             </w:r>
           </w:p>
         </w:tc>

</xml_diff>